<commit_message>
feat: transpose yield recap and refresh documentation
</commit_message>
<xml_diff>
--- a/docs/M2_Family_Summary.docx
+++ b/docs/M2_Family_Summary.docx
@@ -21,7 +21,7 @@
         <w:p>
           <w:r>
             <w:fldChar w:fldCharType="begin" w:dirty="true"/>
-            <w:instrText xml:space="preserve">TOC \o "1-2" \h \z \u</w:instrText>
+            <w:instrText xml:space="preserve">TOC \o "1-3" \h \z \u</w:instrText>
             <w:fldChar w:fldCharType="separate"/>
             <w:fldChar w:fldCharType="end"/>
           </w:r>
@@ -100,7 +100,7 @@
         <w:rPr>
           <w:b/>
         </w:rPr>
-        <w:t xml:space="preserve">42 sheet</w:t>
+        <w:t xml:space="preserve">46 sheet</w:t>
       </w:r>
       <w:r>
         <w:t xml:space="preserve">, termasuk tab</w:t>
@@ -115,7 +115,7 @@
         <w:t xml:space="preserve">M2_Index</w:t>
       </w:r>
       <w:r>
-        <w:t xml:space="preserve">) dan 10 dokumen RE.</w:t>
+        <w:t xml:space="preserve">) dan 11 dokumen RE.</w:t>
       </w:r>
       <w:r>
         <w:t xml:space="preserve"> </w:t>
@@ -127,7 +127,19 @@
         <w:t xml:space="preserve">Cakupan</w:t>
       </w:r>
       <w:r>
-        <w:t xml:space="preserve">: 8 detektor M2 aktif + M2bIntermittent (LSTM-AE, ML skeleton) — Iterasi 2–10. Sumber kebenaran:</w:t>
+        <w:t xml:space="preserve">: 10 detektor M2 — Iterasi 2–11 (termasuk M2bMpptRatio, iterasi 11, dan M2bIntermittent LSTM-AE yang kini</w:t>
+      </w:r>
+      <w:r>
+        <w:t xml:space="preserve"> </w:t>
+      </w:r>
+      <w:r>
+        <w:rPr>
+          <w:b/>
+        </w:rPr>
+        <w:t xml:space="preserve">terlatih</w:t>
+      </w:r>
+      <w:r>
+        <w:t xml:space="preserve">). Sumber kebenaran:</w:t>
       </w:r>
       <w:r>
         <w:t xml:space="preserve"> </w:t>
@@ -160,7 +172,7 @@
         <w:rPr>
           <w:rStyle w:val="VerbatimChar"/>
         </w:rPr>
-        <w:t xml:space="preserve">docs/M2_RE_0X_*.md</w:t>
+        <w:t xml:space="preserve">docs/M2_RE_XX_*.md</w:t>
       </w:r>
       <w:r>
         <w:t xml:space="preserve">.</w:t>
@@ -175,7 +187,19 @@
         <w:t xml:space="preserve">Tanggal</w:t>
       </w:r>
       <w:r>
-        <w:t xml:space="preserve">: 2026-05-30.</w:t>
+        <w:t xml:space="preserve">: 2026-05-30 ·</w:t>
+      </w:r>
+      <w:r>
+        <w:t xml:space="preserve"> </w:t>
+      </w:r>
+      <w:r>
+        <w:rPr>
+          <w:b/>
+        </w:rPr>
+        <w:t xml:space="preserve">Update terakhir</w:t>
+      </w:r>
+      <w:r>
+        <w:t xml:space="preserve">: 2026-07-11 (+MpptRatio/iter-11; LSTM-AE terlatih &amp; wired; ekstensi soiling 2026-07; 42→46 sheet).</w:t>
       </w:r>
     </w:p>
     <w:p>
@@ -189,9 +213,9 @@
       <w:pPr>
         <w:pStyle w:val="Heading2"/>
       </w:pPr>
-      <w:bookmarkStart w:id="21" w:name="peta-detektor-8-aktif-1-ml-skeleton"/>
-      <w:r>
-        <w:t xml:space="preserve">1. Peta Detektor (8 aktif + 1 ML skeleton)</w:t>
+      <w:bookmarkStart w:id="21" w:name="peta-detektor-10-detektor"/>
+      <w:r>
+        <w:t xml:space="preserve">1. Peta Detektor (10 detektor)</w:t>
       </w:r>
       <w:bookmarkEnd w:id="21"/>
     </w:p>
@@ -1169,7 +1193,7 @@
               <w:jc w:val="left"/>
             </w:pPr>
             <w:r>
-              <w:t xml:space="preserve">rdtools SRR (Monte-Carlo) → ekonomi payback cleaning</w:t>
+              <w:t xml:space="preserve">rdtools SRR (Monte-Carlo), PR temperature-corrected + mask availability M2e → ekonomi payback cleaning</w:t>
             </w:r>
           </w:p>
         </w:tc>
@@ -1214,6 +1238,21 @@
                 <w:rStyle w:val="VerbatimChar"/>
               </w:rPr>
               <w:t xml:space="preserve">insufficient_data</w:t>
+            </w:r>
+            <w:r>
+              <w:t xml:space="preserve"> </w:t>
+            </w:r>
+            <w:r>
+              <w:t xml:space="preserve">/</w:t>
+            </w:r>
+            <w:r>
+              <w:t xml:space="preserve"> </w:t>
+            </w:r>
+            <w:r>
+              <w:rPr>
+                <w:rStyle w:val="VerbatimChar"/>
+              </w:rPr>
+              <w:t xml:space="preserve">rdtools_error</w:t>
             </w:r>
           </w:p>
         </w:tc>
@@ -1305,7 +1344,22 @@
               <w:jc w:val="left"/>
             </w:pPr>
             <w:r>
-              <w:t xml:space="preserve">LSTM Autoencoder; reconstruction error window 24-jam (96×15-min)</w:t>
+              <w:t xml:space="preserve">LSTM Autoencoder</w:t>
+            </w:r>
+            <w:r>
+              <w:t xml:space="preserve"> </w:t>
+            </w:r>
+            <w:r>
+              <w:rPr>
+                <w:b/>
+              </w:rPr>
+              <w:t xml:space="preserve">terlatih</w:t>
+            </w:r>
+            <w:r>
+              <w:t xml:space="preserve"> </w:t>
+            </w:r>
+            <w:r>
+              <w:t xml:space="preserve">(2026-07-06); reconstruction error window 24-jam (96×15-min, day-grid)</w:t>
             </w:r>
           </w:p>
         </w:tc>
@@ -1344,7 +1398,26 @@
               <w:rPr>
                 <w:i/>
               </w:rPr>
-              <w:t xml:space="preserve">(tak ada — input-only)</w:t>
+              <w:t xml:space="preserve">(tak ada — input-only; artifact</w:t>
+            </w:r>
+            <w:r>
+              <w:rPr>
+                <w:i/>
+              </w:rPr>
+              <w:t xml:space="preserve"> </w:t>
+            </w:r>
+            <w:r>
+              <w:rPr>
+                <w:rStyle w:val="VerbatimChar"/>
+                <w:i/>
+              </w:rPr>
+              <w:t xml:space="preserve">WindowErrors</w:t>
+            </w:r>
+            <w:r>
+              <w:rPr>
+                <w:i/>
+              </w:rPr>
+              <w:t xml:space="preserve">)</w:t>
             </w:r>
           </w:p>
         </w:tc>
@@ -1359,6 +1432,130 @@
                 <w:b/>
               </w:rPr>
               <w:t xml:space="preserve">INPUT-ONLY</w:t>
+            </w:r>
+          </w:p>
+        </w:tc>
+      </w:tr>
+      <w:tr>
+        <w:tc>
+          <w:p>
+            <w:pPr>
+              <w:pStyle w:val="Compact"/>
+              <w:jc w:val="left"/>
+            </w:pPr>
+            <w:r>
+              <w:t xml:space="preserve">10</w:t>
+            </w:r>
+          </w:p>
+        </w:tc>
+        <w:tc>
+          <w:p>
+            <w:pPr>
+              <w:pStyle w:val="Compact"/>
+              <w:jc w:val="left"/>
+            </w:pPr>
+            <w:r>
+              <w:rPr>
+                <w:b/>
+              </w:rPr>
+              <w:t xml:space="preserve">M2bMpptRatio</w:t>
+            </w:r>
+          </w:p>
+        </w:tc>
+        <w:tc>
+          <w:p>
+            <w:pPr>
+              <w:pStyle w:val="Compact"/>
+              <w:jc w:val="left"/>
+            </w:pPr>
+            <w:r>
+              <w:t xml:space="preserve">rasio arus string vs median partner</w:t>
+            </w:r>
+            <w:r>
+              <w:t xml:space="preserve"> </w:t>
+            </w:r>
+            <w:r>
+              <w:rPr>
+                <w:b/>
+              </w:rPr>
+              <w:t xml:space="preserve">se-MPPT</w:t>
+            </w:r>
+            <w:r>
+              <w:t xml:space="preserve"> </w:t>
+            </w:r>
+            <w:r>
+              <w:t xml:space="preserve">(</w:t>
+            </w:r>
+            <w:r>
+              <w:rPr>
+                <w:rStyle w:val="VerbatimChar"/>
+              </w:rPr>
+              <w:t xml:space="preserve">ratio &lt; 0.85</w:t>
+            </w:r>
+            <w:r>
+              <w:t xml:space="preserve">) + debounce 20 (~100 mnt)</w:t>
+            </w:r>
+          </w:p>
+        </w:tc>
+        <w:tc>
+          <w:p>
+            <w:pPr>
+              <w:pStyle w:val="Compact"/>
+              <w:jc w:val="left"/>
+            </w:pPr>
+            <w:r>
+              <w:rPr>
+                <w:rStyle w:val="VerbatimChar"/>
+              </w:rPr>
+              <w:t xml:space="preserve">mppt_partner_underperform</w:t>
+            </w:r>
+          </w:p>
+        </w:tc>
+        <w:tc>
+          <w:p>
+            <w:pPr>
+              <w:pStyle w:val="Compact"/>
+              <w:jc w:val="left"/>
+            </w:pPr>
+            <w:r>
+              <w:rPr>
+                <w:rStyle w:val="VerbatimChar"/>
+              </w:rPr>
+              <w:t xml:space="preserve">ratio_event_median</w:t>
+            </w:r>
+            <w:r>
+              <w:t xml:space="preserve"> </w:t>
+            </w:r>
+            <w:r>
+              <w:t xml:space="preserve">&lt;0.20 CRIT · &lt;0.50 HIGH · else MED</w:t>
+            </w:r>
+          </w:p>
+        </w:tc>
+        <w:tc>
+          <w:p>
+            <w:pPr>
+              <w:pStyle w:val="Compact"/>
+              <w:jc w:val="left"/>
+            </w:pPr>
+            <w:r>
+              <w:rPr>
+                <w:rStyle w:val="VerbatimChar"/>
+              </w:rPr>
+              <w:t xml:space="preserve">M2b_MpptRatio</w:t>
+            </w:r>
+          </w:p>
+        </w:tc>
+        <w:tc>
+          <w:p>
+            <w:pPr>
+              <w:pStyle w:val="Compact"/>
+              <w:jc w:val="left"/>
+            </w:pPr>
+            <w:r>
+              <w:rPr>
+                <w:b/>
+              </w:rPr>
+              <w:t xml:space="preserve">PENUH</w:t>
             </w:r>
           </w:p>
         </w:tc>
@@ -1511,10 +1708,28 @@
         <w:rPr>
           <w:b/>
         </w:rPr>
-        <w:t xml:space="preserve">M2e, M2bPeerZScore, M2bOpenCircuit, M2aLowIrradiance, M2aShading</w:t>
-      </w:r>
-      <w:r>
-        <w:t xml:space="preserve">.</w:t>
+        <w:t xml:space="preserve">M2e, M2bPeerZScore, M2bOpenCircuit, M2aLowIrradiance, M2aShading, M2bMpptRatio</w:t>
+      </w:r>
+      <w:r>
+        <w:t xml:space="preserve"> </w:t>
+      </w:r>
+      <w:r>
+        <w:t xml:space="preserve">(iter 11 — verifikasi via konsistensi internal 286 finding nyata; lihat caveat di</w:t>
+      </w:r>
+      <w:r>
+        <w:t xml:space="preserve"> </w:t>
+      </w:r>
+      <w:r>
+        <w:rPr>
+          <w:rStyle w:val="VerbatimChar"/>
+        </w:rPr>
+        <w:t xml:space="preserve">M2_RE_11</w:t>
+      </w:r>
+      <w:r>
+        <w:t xml:space="preserve"> </w:t>
+      </w:r>
+      <w:r>
+        <w:t xml:space="preserve">§7).</w:t>
       </w:r>
     </w:p>
     <w:p>
@@ -2891,9 +3106,24 @@
       </w:r>
       <w:r>
         <w:rPr>
-          <w:b/>
-        </w:rPr>
-        <w:t xml:space="preserve">SKELETON</w:t>
+          <w:rStyle w:val="VerbatimChar"/>
+        </w:rPr>
+        <w:t xml:space="preserve">enabled=false</w:t>
+      </w:r>
+      <w:r>
+        <w:t xml:space="preserve"> </w:t>
+      </w:r>
+      <w:r>
+        <w:t xml:space="preserve">di pipeline harian, tapi sejak 2026-07</w:t>
+      </w:r>
+      <w:r>
+        <w:t xml:space="preserve"> </w:t>
+      </w:r>
+      <w:r>
+        <w:rPr>
+          <w:b/>
+        </w:rPr>
+        <w:t xml:space="preserve">matang sebagai analysis run standalone</w:t>
       </w:r>
       <w:r>
         <w:t xml:space="preserve"> </w:t>
@@ -2905,10 +3135,10 @@
         <w:rPr>
           <w:rStyle w:val="VerbatimChar"/>
         </w:rPr>
-        <w:t xml:space="preserve">enabled=false</w:t>
-      </w:r>
-      <w:r>
-        <w:t xml:space="preserve">). Inti = rdtools</w:t>
+        <w:t xml:space="preserve">run_soiling_analysis.py</w:t>
+      </w:r>
+      <w:r>
+        <w:t xml:space="preserve">; run nyata 2025-01..2026-04). Inti = rdtools</w:t>
       </w:r>
       <w:r>
         <w:t xml:space="preserve"> </w:t>
@@ -2923,7 +3153,46 @@
         <w:t xml:space="preserve"> </w:t>
       </w:r>
       <w:r>
-        <w:t xml:space="preserve">(SRR Monte-Carlo 1000-rep) → soiling ratio; butuh ≥90 hari + presipitasi BMKG. Excel mereproduksi</w:t>
+        <w:t xml:space="preserve">(SRR Monte-Carlo 1000-rep) → soiling ratio, kini dengan</w:t>
+      </w:r>
+      <w:r>
+        <w:t xml:space="preserve"> </w:t>
+      </w:r>
+      <w:r>
+        <w:rPr>
+          <w:b/>
+        </w:rPr>
+        <w:t xml:space="preserve">PR temperature-corrected</w:t>
+      </w:r>
+      <w:r>
+        <w:t xml:space="preserve">,</w:t>
+      </w:r>
+      <w:r>
+        <w:t xml:space="preserve"> </w:t>
+      </w:r>
+      <w:r>
+        <w:rPr>
+          <w:b/>
+        </w:rPr>
+        <w:t xml:space="preserve">mask availability M2e</w:t>
+      </w:r>
+      <w:r>
+        <w:t xml:space="preserve">, rekap manual cleaning, CleaningImpact/DirectCleaningImpact, MonthlySoilingLoss, PerInverterSRR opt-in (lihat</w:t>
+      </w:r>
+      <w:r>
+        <w:t xml:space="preserve"> </w:t>
+      </w:r>
+      <w:r>
+        <w:rPr>
+          <w:rStyle w:val="VerbatimChar"/>
+        </w:rPr>
+        <w:t xml:space="preserve">M2_RE_09</w:t>
+      </w:r>
+      <w:r>
+        <w:t xml:space="preserve"> </w:t>
+      </w:r>
+      <w:r>
+        <w:t xml:space="preserve">§0). Excel mereproduksi</w:t>
       </w:r>
       <w:r>
         <w:t xml:space="preserve"> </w:t>
@@ -2953,7 +3222,7 @@
         <w:t xml:space="preserve"> </w:t>
       </w:r>
       <w:r>
-        <w:t xml:space="preserve">= input. Sheet:</w:t>
+        <w:t xml:space="preserve">= input; ekstensi 2026-07 belum di workbook. Sheet:</w:t>
       </w:r>
       <w:r>
         <w:t xml:space="preserve"> </w:t>
@@ -3030,6 +3299,21 @@
         <w:t xml:space="preserve">training_data.py</w:t>
       </w:r>
       <w:r>
+        <w:t xml:space="preserve"> </w:t>
+      </w:r>
+      <w:r>
+        <w:t xml:space="preserve">+</w:t>
+      </w:r>
+      <w:r>
+        <w:t xml:space="preserve"> </w:t>
+      </w:r>
+      <w:r>
+        <w:rPr>
+          <w:rStyle w:val="VerbatimChar"/>
+        </w:rPr>
+        <w:t xml:space="preserve">train_lstm_ae.py</w:t>
+      </w:r>
+      <w:r>
         <w:t xml:space="preserve">,</w:t>
       </w:r>
       <w:r>
@@ -3051,7 +3335,123 @@
         <w:rPr>
           <w:b/>
         </w:rPr>
-        <w:t xml:space="preserve">SKELETON, BLOCKED</w:t>
+        <w:t xml:space="preserve">TERLATIH &amp; WIRED (2026-07)</w:t>
+      </w:r>
+      <w:r>
+        <w:t xml:space="preserve">: model</w:t>
+      </w:r>
+      <w:r>
+        <w:t xml:space="preserve"> </w:t>
+      </w:r>
+      <w:r>
+        <w:rPr>
+          <w:rStyle w:val="VerbatimChar"/>
+        </w:rPr>
+        <w:t xml:space="preserve">lstm_ae_20260706_084352</w:t>
+      </w:r>
+      <w:r>
+        <w:t xml:space="preserve"> </w:t>
+      </w:r>
+      <w:r>
+        <w:t xml:space="preserve">dilatih dari baseline CSV (Sprint 4),</w:t>
+      </w:r>
+      <w:r>
+        <w:t xml:space="preserve"> </w:t>
+      </w:r>
+      <w:r>
+        <w:rPr>
+          <w:rStyle w:val="VerbatimChar"/>
+        </w:rPr>
+        <w:t xml:space="preserve">enabled=True</w:t>
+      </w:r>
+      <w:r>
+        <w:t xml:space="preserve"> </w:t>
+      </w:r>
+      <w:r>
+        <w:t xml:space="preserve">di Cell 4 template. LSTM Autoencoder dilatih pada hari NORMAL; window 24-jam day-grid (96×15-min + night-fill 0, fitur arus PV1..28). Anomali =</w:t>
+      </w:r>
+      <w:r>
+        <w:t xml:space="preserve"> </w:t>
+      </w:r>
+      <w:r>
+        <w:rPr>
+          <w:rStyle w:val="VerbatimChar"/>
+        </w:rPr>
+        <w:t xml:space="preserve">reconstruction_error &gt; μ+3σ</w:t>
+      </w:r>
+      <w:r>
+        <w:t xml:space="preserve"> </w:t>
+      </w:r>
+      <w:r>
+        <w:t xml:space="preserve">→</w:t>
+      </w:r>
+      <w:r>
+        <w:t xml:space="preserve"> </w:t>
+      </w:r>
+      <w:r>
+        <w:rPr>
+          <w:rStyle w:val="VerbatimChar"/>
+        </w:rPr>
+        <w:t xml:space="preserve">intermittent</w:t>
+      </w:r>
+      <w:r>
+        <w:t xml:space="preserve"> </w:t>
+      </w:r>
+      <w:r>
+        <w:t xml:space="preserve">(MEDIUM, conf 70); artifact</w:t>
+      </w:r>
+      <w:r>
+        <w:t xml:space="preserve"> </w:t>
+      </w:r>
+      <w:r>
+        <w:rPr>
+          <w:rStyle w:val="VerbatimChar"/>
+        </w:rPr>
+        <w:t xml:space="preserve">WindowErrors</w:t>
+      </w:r>
+      <w:r>
+        <w:t xml:space="preserve"> </w:t>
+      </w:r>
+      <w:r>
+        <w:t xml:space="preserve">(semua window, untuk ranking harian).</w:t>
+      </w:r>
+      <w:r>
+        <w:t xml:space="preserve"> </w:t>
+      </w:r>
+      <w:r>
+        <w:rPr>
+          <w:b/>
+        </w:rPr>
+        <w:t xml:space="preserve">INPUT-ONLY</w:t>
+      </w:r>
+      <w:r>
+        <w:t xml:space="preserve">: jaringan PyTorch = black box →</w:t>
+      </w:r>
+      <w:r>
+        <w:t xml:space="preserve"> </w:t>
+      </w:r>
+      <w:r>
+        <w:rPr>
+          <w:b/>
+        </w:rPr>
+        <w:t xml:space="preserve">tak ada sheet</w:t>
+      </w:r>
+      <w:r>
+        <w:t xml:space="preserve"> </w:t>
+      </w:r>
+      <w:r>
+        <w:t xml:space="preserve">reproduksi. Detektor paling tidak-Excel di famili.</w:t>
+      </w:r>
+    </w:p>
+    <w:p>
+      <w:pPr>
+        <w:pStyle w:val="BodyText"/>
+      </w:pPr>
+      <w:r>
+        <w:rPr>
+          <w:b/>
+        </w:rPr>
+        <w:t xml:space="preserve">10. M2bMpptRatio</w:t>
       </w:r>
       <w:r>
         <w:t xml:space="preserve"> </w:t>
@@ -3063,67 +3463,166 @@
         <w:rPr>
           <w:rStyle w:val="VerbatimChar"/>
         </w:rPr>
-        <w:t xml:space="preserve">enabled=False</w:t>
-      </w:r>
-      <w:r>
-        <w:t xml:space="preserve">, butuh baseline ≥3 bulan). LSTM Autoencoder dilatih pada hari NORMAL; window 24-jam (96×15-min, fitur arus PV1..28). Anomali =</w:t>
-      </w:r>
-      <w:r>
-        <w:t xml:space="preserve"> </w:t>
-      </w:r>
-      <w:r>
-        <w:rPr>
-          <w:rStyle w:val="VerbatimChar"/>
-        </w:rPr>
-        <w:t xml:space="preserve">reconstruction_error &gt; μ+3σ</w:t>
-      </w:r>
-      <w:r>
-        <w:t xml:space="preserve"> </w:t>
-      </w:r>
-      <w:r>
-        <w:t xml:space="preserve">→</w:t>
-      </w:r>
-      <w:r>
-        <w:t xml:space="preserve"> </w:t>
-      </w:r>
-      <w:r>
-        <w:rPr>
-          <w:rStyle w:val="VerbatimChar"/>
-        </w:rPr>
-        <w:t xml:space="preserve">intermittent</w:t>
-      </w:r>
-      <w:r>
-        <w:t xml:space="preserve"> </w:t>
-      </w:r>
-      <w:r>
-        <w:t xml:space="preserve">(MEDIUM, conf 70).</w:t>
-      </w:r>
-      <w:r>
-        <w:t xml:space="preserve"> </w:t>
-      </w:r>
-      <w:r>
-        <w:rPr>
-          <w:b/>
-        </w:rPr>
-        <w:t xml:space="preserve">INPUT-ONLY</w:t>
-      </w:r>
-      <w:r>
-        <w:t xml:space="preserve">: jaringan PyTorch = black box →</w:t>
-      </w:r>
-      <w:r>
-        <w:t xml:space="preserve"> </w:t>
-      </w:r>
-      <w:r>
-        <w:rPr>
-          <w:b/>
-        </w:rPr>
-        <w:t xml:space="preserve">tak ada sheet</w:t>
-      </w:r>
-      <w:r>
-        <w:t xml:space="preserve"> </w:t>
-      </w:r>
-      <w:r>
-        <w:t xml:space="preserve">(lapisan data-pipeline diverifikasi dengan kode asli, neural net didokumentasikan). Detektor paling tidak-Excel di famili.</w:t>
+        <w:t xml:space="preserve">mppt_ratio.py</w:t>
+      </w:r>
+      <w:r>
+        <w:t xml:space="preserve">,</w:t>
+      </w:r>
+      <w:r>
+        <w:t xml:space="preserve"> </w:t>
+      </w:r>
+      <w:r>
+        <w:rPr>
+          <w:rStyle w:val="VerbatimChar"/>
+        </w:rPr>
+        <w:t xml:space="preserve">M2_RE_11</w:t>
+      </w:r>
+      <w:r>
+        <w:t xml:space="preserve">, iter 11) — String underperform relatif</w:t>
+      </w:r>
+      <w:r>
+        <w:t xml:space="preserve"> </w:t>
+      </w:r>
+      <w:r>
+        <w:rPr>
+          <w:b/>
+        </w:rPr>
+        <w:t xml:space="preserve">sibling se-MPPT</w:t>
+      </w:r>
+      <w:r>
+        <w:t xml:space="preserve"> </w:t>
+      </w:r>
+      <w:r>
+        <w:t xml:space="preserve">(grup dari</w:t>
+      </w:r>
+      <w:r>
+        <w:t xml:space="preserve"> </w:t>
+      </w:r>
+      <w:r>
+        <w:rPr>
+          <w:rStyle w:val="VerbatimChar"/>
+        </w:rPr>
+        <w:t xml:space="preserve">mppt_map</w:t>
+      </w:r>
+      <w:r>
+        <w:t xml:space="preserve"> </w:t>
+      </w:r>
+      <w:r>
+        <w:t xml:space="preserve">di</w:t>
+      </w:r>
+      <w:r>
+        <w:t xml:space="preserve"> </w:t>
+      </w:r>
+      <w:r>
+        <w:rPr>
+          <w:rStyle w:val="VerbatimChar"/>
+        </w:rPr>
+        <w:t xml:space="preserve">strings.yaml</w:t>
+      </w:r>
+      <w:r>
+        <w:t xml:space="preserve">):</w:t>
+      </w:r>
+      <w:r>
+        <w:t xml:space="preserve"> </w:t>
+      </w:r>
+      <w:r>
+        <w:rPr>
+          <w:rStyle w:val="VerbatimChar"/>
+        </w:rPr>
+        <w:t xml:space="preserve">ratio(t) = I_string/median(I_partner)</w:t>
+      </w:r>
+      <w:r>
+        <w:t xml:space="preserve">, qualifying bila</w:t>
+      </w:r>
+      <w:r>
+        <w:t xml:space="preserve"> </w:t>
+      </w:r>
+      <w:r>
+        <w:rPr>
+          <w:rStyle w:val="VerbatimChar"/>
+        </w:rPr>
+        <w:t xml:space="preserve">&lt; 0.85</w:t>
+      </w:r>
+      <w:r>
+        <w:t xml:space="preserve"> </w:t>
+      </w:r>
+      <w:r>
+        <w:t xml:space="preserve">+ gate daylight, debounce 20 langkah (~100 mnt). Severity dari</w:t>
+      </w:r>
+      <w:r>
+        <w:t xml:space="preserve"> </w:t>
+      </w:r>
+      <w:r>
+        <w:rPr>
+          <w:rStyle w:val="VerbatimChar"/>
+        </w:rPr>
+        <w:t xml:space="preserve">ratio_event_median</w:t>
+      </w:r>
+      <w:r>
+        <w:t xml:space="preserve"> </w:t>
+      </w:r>
+      <w:r>
+        <w:t xml:space="preserve">(&lt;0.20 CRIT, &lt;0.50 HIGH, else MED); confidence</w:t>
+      </w:r>
+      <w:r>
+        <w:t xml:space="preserve"> </w:t>
+      </w:r>
+      <w:r>
+        <w:rPr>
+          <w:rStyle w:val="VerbatimChar"/>
+        </w:rPr>
+        <w:t xml:space="preserve">min(90, max(50, (1−rem)·100))</w:t>
+      </w:r>
+      <w:r>
+        <w:t xml:space="preserve">. Z-score tak feasible di grup kecil (|z| max = (N−1)/√N). Repro PENUH. Sheet:</w:t>
+      </w:r>
+      <w:r>
+        <w:t xml:space="preserve"> </w:t>
+      </w:r>
+      <w:r>
+        <w:rPr>
+          <w:rStyle w:val="VerbatimChar"/>
+        </w:rPr>
+        <w:t xml:space="preserve">Raw_Data_MR</w:t>
+      </w:r>
+      <w:r>
+        <w:t xml:space="preserve">,</w:t>
+      </w:r>
+      <w:r>
+        <w:t xml:space="preserve"> </w:t>
+      </w:r>
+      <w:r>
+        <w:rPr>
+          <w:rStyle w:val="VerbatimChar"/>
+        </w:rPr>
+        <w:t xml:space="preserve">Helpers_MR</w:t>
+      </w:r>
+      <w:r>
+        <w:t xml:space="preserve">,</w:t>
+      </w:r>
+      <w:r>
+        <w:t xml:space="preserve"> </w:t>
+      </w:r>
+      <w:r>
+        <w:rPr>
+          <w:rStyle w:val="VerbatimChar"/>
+        </w:rPr>
+        <w:t xml:space="preserve">M2b_MpptRatio</w:t>
+      </w:r>
+      <w:r>
+        <w:t xml:space="preserve">,</w:t>
+      </w:r>
+      <w:r>
+        <w:t xml:space="preserve"> </w:t>
+      </w:r>
+      <w:r>
+        <w:rPr>
+          <w:rStyle w:val="VerbatimChar"/>
+        </w:rPr>
+        <w:t xml:space="preserve">M2b_MR_StringStatus</w:t>
+      </w:r>
+      <w:r>
+        <w:t xml:space="preserve">.</w:t>
       </w:r>
     </w:p>
     <w:p>
@@ -3137,9 +3636,9 @@
       <w:pPr>
         <w:pStyle w:val="Heading2"/>
       </w:pPr>
-      <w:bookmarkStart w:id="24" w:name="inventaris-42-sheet-workbook"/>
-      <w:r>
-        <w:t xml:space="preserve">4. Inventaris 42 Sheet Workbook</w:t>
+      <w:bookmarkStart w:id="24" w:name="inventaris-46-sheet-workbook"/>
+      <w:r>
+        <w:t xml:space="preserve">4. Inventaris 46 Sheet Workbook</w:t>
       </w:r>
       <w:bookmarkEnd w:id="24"/>
     </w:p>
@@ -3909,6 +4408,78 @@
           </w:p>
         </w:tc>
       </w:tr>
+      <w:tr>
+        <w:tc>
+          <w:p>
+            <w:pPr>
+              <w:pStyle w:val="Compact"/>
+              <w:jc w:val="left"/>
+            </w:pPr>
+            <w:r>
+              <w:rPr>
+                <w:b/>
+              </w:rPr>
+              <w:t xml:space="preserve">M2b MpptRatio</w:t>
+            </w:r>
+            <w:r>
+              <w:t xml:space="preserve"> </w:t>
+            </w:r>
+            <w:r>
+              <w:t xml:space="preserve">(iter 11)</w:t>
+            </w:r>
+          </w:p>
+        </w:tc>
+        <w:tc>
+          <w:p>
+            <w:pPr>
+              <w:pStyle w:val="Compact"/>
+              <w:jc w:val="left"/>
+            </w:pPr>
+            <w:r>
+              <w:rPr>
+                <w:rStyle w:val="VerbatimChar"/>
+              </w:rPr>
+              <w:t xml:space="preserve">Raw_Data_MR</w:t>
+            </w:r>
+            <w:r>
+              <w:t xml:space="preserve">,</w:t>
+            </w:r>
+            <w:r>
+              <w:t xml:space="preserve"> </w:t>
+            </w:r>
+            <w:r>
+              <w:rPr>
+                <w:rStyle w:val="VerbatimChar"/>
+              </w:rPr>
+              <w:t xml:space="preserve">Helpers_MR</w:t>
+            </w:r>
+            <w:r>
+              <w:t xml:space="preserve">,</w:t>
+            </w:r>
+            <w:r>
+              <w:t xml:space="preserve"> </w:t>
+            </w:r>
+            <w:r>
+              <w:rPr>
+                <w:rStyle w:val="VerbatimChar"/>
+              </w:rPr>
+              <w:t xml:space="preserve">M2b_MpptRatio</w:t>
+            </w:r>
+            <w:r>
+              <w:t xml:space="preserve">,</w:t>
+            </w:r>
+            <w:r>
+              <w:t xml:space="preserve"> </w:t>
+            </w:r>
+            <w:r>
+              <w:rPr>
+                <w:rStyle w:val="VerbatimChar"/>
+              </w:rPr>
+              <w:t xml:space="preserve">M2b_MR_StringStatus</w:t>
+            </w:r>
+          </w:p>
+        </w:tc>
+      </w:tr>
     </w:tbl>
     <w:p>
       <w:pPr>
@@ -3986,9 +4557,9 @@
       <w:pPr>
         <w:pStyle w:val="Heading2"/>
       </w:pPr>
-      <w:bookmarkStart w:id="25" w:name="X19202a614078b2ec0aa9cf9fa23f896a6dbe166"/>
-      <w:r>
-        <w:t xml:space="preserve">5. Metodologi Verifikasi (konsisten Iterasi 4–9)</w:t>
+      <w:bookmarkStart w:id="25" w:name="X177b6d3a6f1687ea61b27b7e8f5f2fe9fa78aed"/>
+      <w:r>
+        <w:t xml:space="preserve">5. Metodologi Verifikasi (konsisten Iterasi 4–11)</w:t>
       </w:r>
       <w:bookmarkEnd w:id="25"/>
     </w:p>
@@ -4271,11 +4842,41 @@
       <w:pPr>
         <w:pStyle w:val="Heading2"/>
       </w:pPr>
-      <w:bookmarkStart w:id="26" w:name="detektor-m2-belum-aktif-belum-bermodul"/>
-      <w:r>
-        <w:t xml:space="preserve">6. Detektor M2 — Belum Aktif / Belum Bermodul</w:t>
+      <w:bookmarkStart w:id="26" w:name="detektor-m2-belum-bermodul"/>
+      <w:r>
+        <w:t xml:space="preserve">6. Detektor M2 — Belum Bermodul</w:t>
       </w:r>
       <w:bookmarkEnd w:id="26"/>
+    </w:p>
+    <w:p>
+      <w:pPr>
+        <w:pStyle w:val="FirstParagraph"/>
+      </w:pPr>
+      <w:r>
+        <w:rPr>
+          <w:i/>
+        </w:rPr>
+        <w:t xml:space="preserve">(M2bIntermittent LSTM-AE keluar dari tabel ini per 2026-07: model terlatih &amp; wired — lihat peta §1 #9 dan</w:t>
+      </w:r>
+      <w:r>
+        <w:rPr>
+          <w:i/>
+        </w:rPr>
+        <w:t xml:space="preserve"> </w:t>
+      </w:r>
+      <w:r>
+        <w:rPr>
+          <w:rStyle w:val="VerbatimChar"/>
+          <w:i/>
+        </w:rPr>
+        <w:t xml:space="preserve">M2_RE_10</w:t>
+      </w:r>
+      <w:r>
+        <w:rPr>
+          <w:i/>
+        </w:rPr>
+        <w:t xml:space="preserve">.)</w:t>
+      </w:r>
     </w:p>
     <w:tbl>
       <w:tblPr>
@@ -4373,112 +4974,6 @@
               <w:rPr>
                 <w:b/>
               </w:rPr>
-              <w:t xml:space="preserve">M2bIntermittent (LSTM-AE)</w:t>
-            </w:r>
-          </w:p>
-        </w:tc>
-        <w:tc>
-          <w:p>
-            <w:pPr>
-              <w:pStyle w:val="Compact"/>
-              <w:jc w:val="left"/>
-            </w:pPr>
-            <w:r>
-              <w:rPr>
-                <w:rStyle w:val="VerbatimChar"/>
-              </w:rPr>
-              <w:t xml:space="preserve">lstm_ae.py</w:t>
-            </w:r>
-          </w:p>
-        </w:tc>
-        <w:tc>
-          <w:p>
-            <w:pPr>
-              <w:pStyle w:val="Compact"/>
-              <w:jc w:val="left"/>
-            </w:pPr>
-            <w:r>
-              <w:t xml:space="preserve">Skeleton,</w:t>
-            </w:r>
-            <w:r>
-              <w:t xml:space="preserve"> </w:t>
-            </w:r>
-            <w:r>
-              <w:rPr>
-                <w:b/>
-              </w:rPr>
-              <w:t xml:space="preserve">BLOCKED</w:t>
-            </w:r>
-            <w:r>
-              <w:t xml:space="preserve"> </w:t>
-            </w:r>
-            <w:r>
-              <w:t xml:space="preserve">(≥3 bln baseline) — kini</w:t>
-            </w:r>
-            <w:r>
-              <w:t xml:space="preserve"> </w:t>
-            </w:r>
-            <w:r>
-              <w:rPr>
-                <w:b/>
-              </w:rPr>
-              <w:t xml:space="preserve">terdokumentasi</w:t>
-            </w:r>
-            <w:r>
-              <w:t xml:space="preserve"> </w:t>
-            </w:r>
-            <w:r>
-              <w:t xml:space="preserve">(</w:t>
-            </w:r>
-            <w:r>
-              <w:rPr>
-                <w:rStyle w:val="VerbatimChar"/>
-              </w:rPr>
-              <w:t xml:space="preserve">M2_RE_10</w:t>
-            </w:r>
-            <w:r>
-              <w:t xml:space="preserve">, peta §1 #9)</w:t>
-            </w:r>
-          </w:p>
-        </w:tc>
-        <w:tc>
-          <w:p>
-            <w:pPr>
-              <w:pStyle w:val="Compact"/>
-              <w:jc w:val="left"/>
-            </w:pPr>
-            <w:r>
-              <w:t xml:space="preserve">PyTorch autoencoder;</w:t>
-            </w:r>
-            <w:r>
-              <w:t xml:space="preserve"> </w:t>
-            </w:r>
-            <w:r>
-              <w:rPr>
-                <w:b/>
-              </w:rPr>
-              <w:t xml:space="preserve">INPUT-ONLY</w:t>
-            </w:r>
-            <w:r>
-              <w:t xml:space="preserve"> </w:t>
-            </w:r>
-            <w:r>
-              <w:t xml:space="preserve">(black box, tak ada sheet)</w:t>
-            </w:r>
-          </w:p>
-        </w:tc>
-      </w:tr>
-      <w:tr>
-        <w:tc>
-          <w:p>
-            <w:pPr>
-              <w:pStyle w:val="Compact"/>
-              <w:jc w:val="left"/>
-            </w:pPr>
-            <w:r>
-              <w:rPr>
-                <w:b/>
-              </w:rPr>
               <w:t xml:space="preserve">M2c Microcrack</w:t>
             </w:r>
           </w:p>
@@ -4675,7 +5170,22 @@
         <w:rPr>
           <w:rStyle w:val="VerbatimChar"/>
         </w:rPr>
-        <w:t xml:space="preserve">docs/M2_RE_03_M2bPeerZScore.md</w:t>
+        <w:t xml:space="preserve">docs/M2_RE_02_M2eAvailability.md</w:t>
+      </w:r>
+      <w:r>
+        <w:t xml:space="preserve"> </w:t>
+      </w:r>
+      <w:r>
+        <w:t xml:space="preserve">·</w:t>
+      </w:r>
+      <w:r>
+        <w:t xml:space="preserve"> </w:t>
+      </w:r>
+      <w:r>
+        <w:rPr>
+          <w:rStyle w:val="VerbatimChar"/>
+        </w:rPr>
+        <w:t xml:space="preserve">M2_RE_03_M2bPeerZScore.md</w:t>
       </w:r>
       <w:r>
         <w:t xml:space="preserve"> </w:t>
@@ -4782,6 +5292,21 @@
         </w:rPr>
         <w:t xml:space="preserve">M2_RE_10_M2bIntermittent.md</w:t>
       </w:r>
+      <w:r>
+        <w:t xml:space="preserve"> </w:t>
+      </w:r>
+      <w:r>
+        <w:t xml:space="preserve">·</w:t>
+      </w:r>
+      <w:r>
+        <w:t xml:space="preserve"> </w:t>
+      </w:r>
+      <w:r>
+        <w:rPr>
+          <w:rStyle w:val="VerbatimChar"/>
+        </w:rPr>
+        <w:t xml:space="preserve">M2_RE_11_M2bMpptRatio.md</w:t>
+      </w:r>
     </w:p>
     <w:p>
       <w:pPr>
@@ -4823,7 +5348,7 @@
         <w:t xml:space="preserve"> </w:t>
       </w:r>
       <w:r>
-        <w:t xml:space="preserve">— 42 sheet (tab</w:t>
+        <w:t xml:space="preserve">— 46 sheet (tab</w:t>
       </w:r>
       <w:r>
         <w:t xml:space="preserve"> </w:t>
@@ -4905,28 +5430,31 @@
         <w:pStyle w:val="FirstParagraph"/>
       </w:pPr>
       <w:r>
-        <w:t xml:space="preserve">Sepuluh iterasi (2–10) menghasilkan:</w:t>
-      </w:r>
-      <w:r>
-        <w:t xml:space="preserve"> </w:t>
-      </w:r>
-      <w:r>
-        <w:rPr>
-          <w:b/>
-        </w:rPr>
-        <w:t xml:space="preserve">8 detektor aktif + M2bIntermittent (LSTM-AE skeleton) ter-reverse-engineer</w:t>
-      </w:r>
-      <w:r>
-        <w:t xml:space="preserve">,</w:t>
-      </w:r>
-      <w:r>
-        <w:t xml:space="preserve"> </w:t>
-      </w:r>
-      <w:r>
-        <w:rPr>
-          <w:b/>
-        </w:rPr>
-        <w:t xml:space="preserve">42-sheet workbook</w:t>
+        <w:t xml:space="preserve">Sepuluh iterasi (2–11) menghasilkan:</w:t>
+      </w:r>
+      <w:r>
+        <w:t xml:space="preserve"> </w:t>
+      </w:r>
+      <w:r>
+        <w:rPr>
+          <w:b/>
+        </w:rPr>
+        <w:t xml:space="preserve">10 detektor ter-reverse-engineer</w:t>
+      </w:r>
+      <w:r>
+        <w:t xml:space="preserve"> </w:t>
+      </w:r>
+      <w:r>
+        <w:t xml:space="preserve">(termasuk LSTM-AE yang kini terlatih &amp; wired),</w:t>
+      </w:r>
+      <w:r>
+        <w:t xml:space="preserve"> </w:t>
+      </w:r>
+      <w:r>
+        <w:rPr>
+          <w:b/>
+        </w:rPr>
+        <w:t xml:space="preserve">46-sheet workbook</w:t>
       </w:r>
       <w:r>
         <w:t xml:space="preserve"> </w:t>
@@ -4941,13 +5469,13 @@
         <w:rPr>
           <w:b/>
         </w:rPr>
-        <w:t xml:space="preserve">10 dokumen</w:t>
-      </w:r>
-      <w:r>
-        <w:t xml:space="preserve"> </w:t>
-      </w:r>
-      <w:r>
-        <w:t xml:space="preserve">(9 deep-dive + overview) + ringkasan ini. Setiap angka di workbook dapat ditelusuri ke source Python, dengan status reproduksibilitas yang jujur (penuh / input-representatif / hilir-penuh / approksimasi / input-only).</w:t>
+        <w:t xml:space="preserve">11 dokumen</w:t>
+      </w:r>
+      <w:r>
+        <w:t xml:space="preserve"> </w:t>
+      </w:r>
+      <w:r>
+        <w:t xml:space="preserve">(10 deep-dive + overview) + ringkasan ini. Setiap angka di workbook dapat ditelusuri ke source Python, dengan status reproduksibilitas yang jujur (penuh / input-representatif / hilir-penuh / approksimasi / input-only).</w:t>
       </w:r>
       <w:r>
         <w:t xml:space="preserve"> </w:t>
@@ -5035,7 +5563,19 @@
         <w:t xml:space="preserve"> </w:t>
       </w:r>
       <w:r>
-        <w:t xml:space="preserve">lalu recalc), atau menunggu baseline ≥3 bulan untuk benar-benar melatih LSTM-AE. Detektor sisa (M2c Microcrack, M2d Bifacial, M2f Loss-Attribution) butuh hardware/modul baru.</w:t>
+        <w:t xml:space="preserve">lalu recalc), memvalidasi model LSTM-AE terhadap hari-fault berlabel, atau membawa ekstensi soiling 2026-07 (</w:t>
+      </w:r>
+      <w:r>
+        <w:rPr>
+          <w:rStyle w:val="VerbatimChar"/>
+        </w:rPr>
+        <w:t xml:space="preserve">M2_RE_09</w:t>
+      </w:r>
+      <w:r>
+        <w:t xml:space="preserve"> </w:t>
+      </w:r>
+      <w:r>
+        <w:t xml:space="preserve">§0) ke workbook. Detektor sisa (M2c Microcrack, M2d Bifacial, M2f Loss-Attribution) butuh hardware/modul baru.</w:t>
       </w:r>
     </w:p>
     <w:sectPr/>

</xml_diff>